<commit_message>
Update Rotordyn_AI_Plots_Specification_Report.docx with mathematical formulas
</commit_message>
<xml_diff>
--- a/Rotordyn_AI_Plots_Specification_Report.docx
+++ b/Rotordyn_AI_Plots_Specification_Report.docx
@@ -201,7 +201,7 @@
                 <w:b/>
                 <w:sz w:val="19"/>
               </w:rPr>
-              <w:t>Calculations / Transformations</w:t>
+              <w:t>Calculations / Formulas Used</w:t>
             </w:r>
           </w:p>
         </w:tc>
@@ -214,13 +214,22 @@
               <w:rPr>
                 <w:sz w:val="19"/>
               </w:rPr>
-              <w:t>Generalized coordinate projection system:</w:t>
+              <w:t>1. Probe Dynamic Signals:</w:t>
               <w:br/>
-              <w:t>x = -((Sx * sin(theta_Y) - Sy * sin(theta_X)) / sin(theta_Y - theta_X))</w:t>
+              <w:t xml:space="preserve">   Sx(t) = Ax * cos(w*t - px)</w:t>
               <w:br/>
-              <w:t>y = (-Sx * cos(theta_Y) + Sy * cos(theta_X)) / sin(theta_Y - theta_X)</w:t>
+              <w:t xml:space="preserve">   Sy(t) = Ay * sin(w*t - py)</w:t>
               <w:br/>
-              <w:t>Where theta_X and theta_Y are custom physical angles of the proximity probes (default 135 and 45 degrees).</w:t>
+              <w:t xml:space="preserve">   (Where Ax, Ay are amplitudes, and px, py are phase angles in radians)</w:t>
+              <w:br/>
+              <w:br/>
+              <w:t>2. Coordinate Transformation Equations:</w:t>
+              <w:br/>
+              <w:t xml:space="preserve">   x(t) = -((Sx(t) * sin(theta_Y) - Sy(t) * sin(theta_X)) / sin(theta_Y - theta_X))</w:t>
+              <w:br/>
+              <w:t xml:space="preserve">   y(t) = (-Sx(t) * cos(theta_Y) + Sy(t) * cos(theta_X)) / sin(theta_Y - theta_X)</w:t>
+              <w:br/>
+              <w:t xml:space="preserve">   (Where theta_X and theta_Y are custom physical angles of the probes, default 135 and 45 degrees).</w:t>
             </w:r>
           </w:p>
         </w:tc>
@@ -542,7 +551,7 @@
                 <w:b/>
                 <w:sz w:val="19"/>
               </w:rPr>
-              <w:t>Calculations / Transformations</w:t>
+              <w:t>Calculations / Formulas Used</w:t>
             </w:r>
           </w:p>
         </w:tc>
@@ -555,13 +564,20 @@
               <w:rPr>
                 <w:sz w:val="19"/>
               </w:rPr>
-              <w:t>Displacements mapping:</w:t>
+              <w:t>1. Probe Axis Displacements (mils/micrometers):</w:t>
               <w:br/>
-              <w:t>dx = (V_gap_X - V_rest_X) * SF</w:t>
+              <w:t xml:space="preserve">   S_dc_X = (V_gap_X - V_rest_X) * SF</w:t>
               <w:br/>
-              <w:t>dy = (V_gap_Y - V_rest_Y) * SF</w:t>
+              <w:t xml:space="preserve">   S_dc_Y = (V_gap_Y - V_rest_Y) * SF</w:t>
               <w:br/>
-              <w:t>Where SF is the Probe Scale Factor (default 5.0 mils/V), V_rest is the reference rest gap voltage, and positions are mapped through the generalized probe angle matrix.</w:t>
+              <w:t xml:space="preserve">   (Where V_gap is live gap voltage, V_rest is reference rest gap voltage, and SF is Scale Factor, default 5.0 mils/V)</w:t>
+              <w:br/>
+              <w:br/>
+              <w:t>2. Centerline Coordinates Mapping:</w:t>
+              <w:br/>
+              <w:t xml:space="preserve">   x_cl = -((S_dc_X * sin(theta_Y) - S_dc_Y * sin(theta_X)) / sin(theta_Y - theta_X))</w:t>
+              <w:br/>
+              <w:t xml:space="preserve">   y_cl = (-S_dc_X * cos(theta_Y) + S_dc_Y * cos(theta_X)) / sin(theta_Y - theta_X)</w:t>
             </w:r>
           </w:p>
         </w:tc>
@@ -879,7 +895,7 @@
                 <w:b/>
                 <w:sz w:val="19"/>
               </w:rPr>
-              <w:t>Calculations / Transformations</w:t>
+              <w:t>Calculations / Formulas Used</w:t>
             </w:r>
           </w:p>
         </w:tc>
@@ -892,7 +908,13 @@
               <w:rPr>
                 <w:sz w:val="19"/>
               </w:rPr>
-              <w:t>Combined centerline position offset (dx, dy) plus dynamic orbit projection vector offsets mapped at specific RPM steps (e.g., 500, 1500, 2500, 3000 RPM).</w:t>
+              <w:t>1. Overlay Position Formulas:</w:t>
+              <w:br/>
+              <w:t xml:space="preserve">   X_total(t) = x_cl + x(t)</w:t>
+              <w:br/>
+              <w:t xml:space="preserve">   Y_total(t) = y_cl + y(t)</w:t>
+              <w:br/>
+              <w:t xml:space="preserve">   (Where [x_cl, y_cl] is the centerline average position, and [x(t), y(t)] is the dynamic orbit lissajous deflection at a given speed steps, calculated using generalized probe orientation math).</w:t>
             </w:r>
           </w:p>
         </w:tc>
@@ -1214,7 +1236,7 @@
                 <w:b/>
                 <w:sz w:val="19"/>
               </w:rPr>
-              <w:t>Calculations / Transformations</w:t>
+              <w:t>Calculations / Formulas Used</w:t>
             </w:r>
           </w:p>
         </w:tc>
@@ -1227,11 +1249,27 @@
               <w:rPr>
                 <w:sz w:val="19"/>
               </w:rPr>
-              <w:t>Optional vector subtraction of low-speed (Slow-Roll) baseline vector:</w:t>
+              <w:t>1. Slow-Roll Vector Substraction:</w:t>
               <w:br/>
-              <w:t>V_comp = V_raw - V_slow_roll</w:t>
+              <w:t xml:space="preserve">   V_raw = A_raw * e^(i * p_raw)</w:t>
               <w:br/>
-              <w:t>Phase unwrapping algorithms applied to display continuous phase trends.</w:t>
+              <w:t xml:space="preserve">   V_sr = A_sr * e^(i * p_sr)</w:t>
+              <w:br/>
+              <w:t xml:space="preserve">   V_comp = V_raw - V_sr</w:t>
+              <w:br/>
+              <w:br/>
+              <w:t>2. Real &amp; Imaginary Component Expansion:</w:t>
+              <w:br/>
+              <w:t xml:space="preserve">   Re = A_raw * cos(p_raw) - A_sr * cos(p_sr)</w:t>
+              <w:br/>
+              <w:t xml:space="preserve">   Im = A_raw * sin(p_raw) - A_sr * sin(p_sr)</w:t>
+              <w:br/>
+              <w:br/>
+              <w:t>3. Amplitude &amp; Phase Conversion:</w:t>
+              <w:br/>
+              <w:t xml:space="preserve">   A_comp = sqrt(Re^2 + Im^2)</w:t>
+              <w:br/>
+              <w:t xml:space="preserve">   p_comp = atan2(Im, Re)</w:t>
             </w:r>
           </w:p>
         </w:tc>
@@ -1553,7 +1591,7 @@
                 <w:b/>
                 <w:sz w:val="19"/>
               </w:rPr>
-              <w:t>Calculations / Transformations</w:t>
+              <w:t>Calculations / Formulas Used</w:t>
             </w:r>
           </w:p>
         </w:tc>
@@ -1566,7 +1604,20 @@
               <w:rPr>
                 <w:sz w:val="19"/>
               </w:rPr>
-              <w:t>Slow-Roll vector compensation math (subtracting static runout vector). Phase angle mapping to polar coordinates.</w:t>
+              <w:t>1. Polar Path Coordinates Mapping:</w:t>
+              <w:br/>
+              <w:t xml:space="preserve">   r = A_comp</w:t>
+              <w:br/>
+              <w:t xml:space="preserve">   theta = p_comp</w:t>
+              <w:br/>
+              <w:t xml:space="preserve">   (Where A_comp and p_comp are the compensated amplitude and phase)</w:t>
+              <w:br/>
+              <w:br/>
+              <w:t>2. Cartesian Plot Conversion:</w:t>
+              <w:br/>
+              <w:t xml:space="preserve">   x_polar = A_comp * cos(p_comp)</w:t>
+              <w:br/>
+              <w:t xml:space="preserve">   y_polar = A_comp * sin(p_comp)</w:t>
             </w:r>
           </w:p>
         </w:tc>
@@ -1886,7 +1937,7 @@
                 <w:b/>
                 <w:sz w:val="19"/>
               </w:rPr>
-              <w:t>Calculations / Transformations</w:t>
+              <w:t>Calculations / Formulas Used</w:t>
             </w:r>
           </w:p>
         </w:tc>
@@ -1899,7 +1950,16 @@
               <w:rPr>
                 <w:sz w:val="19"/>
               </w:rPr>
-              <w:t>Cooley-Tukey Fast Fourier Transform (FFT) algorithm calculated client-side in JS, converting raw waveform amplitudes to spectral energy peaks.</w:t>
+              <w:t>1. Discrete Fourier Transform (DFT):</w:t>
+              <w:br/>
+              <w:t xml:space="preserve">   X[k] = Sum_{n=0}^{N-1} ( x[n] * e^(-i * 2*pi * k * n / N) )</w:t>
+              <w:br/>
+              <w:t xml:space="preserve">   (Calculated via client-side Cooley-Tukey FFT algorithm)</w:t>
+              <w:br/>
+              <w:br/>
+              <w:t>2. Scaling for Single-Sided Amplitude:</w:t>
+              <w:br/>
+              <w:t xml:space="preserve">   Amp[k] = (2 / N) * sqrt( Re(X[k])^2 + Im(X[k])^2 )</w:t>
             </w:r>
           </w:p>
         </w:tc>
@@ -2221,7 +2281,7 @@
                 <w:b/>
                 <w:sz w:val="19"/>
               </w:rPr>
-              <w:t>Calculations / Transformations</w:t>
+              <w:t>Calculations / Formulas Used</w:t>
             </w:r>
           </w:p>
         </w:tc>
@@ -2234,7 +2294,11 @@
               <w:rPr>
                 <w:sz w:val="19"/>
               </w:rPr>
-              <w:t>3D surface mesh generation interpolating sequential FFT slices across the rotational speed dimension.</w:t>
+              <w:t>1. Waterfall Matrix Representation:</w:t>
+              <w:br/>
+              <w:t xml:space="preserve">   Waterfall_Grid[f, RPM] = Amp_RPM[f]</w:t>
+              <w:br/>
+              <w:t xml:space="preserve">   (Where Amp_RPM is the FFT amplitude slice evaluated at a given machine speed parameter)</w:t>
             </w:r>
           </w:p>
         </w:tc>
@@ -2554,7 +2618,7 @@
                 <w:b/>
                 <w:sz w:val="19"/>
               </w:rPr>
-              <w:t>Calculations / Transformations</w:t>
+              <w:t>Calculations / Formulas Used</w:t>
             </w:r>
           </w:p>
         </w:tc>
@@ -2567,7 +2631,11 @@
               <w:rPr>
                 <w:sz w:val="19"/>
               </w:rPr>
-              <w:t>Moving average filters and peak calculation algorithms for trend smoothing.</w:t>
+              <w:t>1. Direct Vibration Peak-to-Peak:</w:t>
+              <w:br/>
+              <w:t xml:space="preserve">   Direct_pk_pk = max_{t in T}(S(t)) - min_{t in T}(S(t))</w:t>
+              <w:br/>
+              <w:t xml:space="preserve">   (Calculated over rolling window timeframes T)</w:t>
             </w:r>
           </w:p>
         </w:tc>

</xml_diff>